<commit_message>
docs: add drug candidate filter analysis to post-merge study guide
New limitation bullet in section 6.11 documenting the therapeutic filter
investigation: 74 drugs (0.7%) qualify only via weak edge types
(TESTS_INTERVENTION or compoundCausesSideEffect), proposed stricter
filter, and detailed Ifosfamide/Thiotepa/Iopamidol case analysis.
</commit_message>
<xml_diff>
--- a/docs/CardioKB_PostMerge_Study_Guide_July11.docx
+++ b/docs/CardioKB_PostMerge_Study_Guide_July11.docx
@@ -8440,6 +8440,15 @@
       </w:pPr>
       <w:r>
         <w:t>Limited graph connectivity drugs. Some predicted drugs have connectivity limited to a compoundInPharmacologicClass edge, with predictions driven by the class node's embedding rather than the drug's own pharmacological profile.</w:t>
+      </w:r>
+    </w:p>
+    <w:p>
+      <w:pPr>
+        <w:pStyle w:val="ListBullet"/>
+        <w:ind w:left="720"/>
+      </w:pPr>
+      <w:r>
+        <w:t>Drug candidate filter analysis. The therapeutic filter that restricts link prediction scoring to drugs with at least one signal edge uses the set: drugBindsGene, compoundInPharmacologicClass, compoundCausesSideEffect, drugTreatsDisease, AFFECTS_RESPONSE_TO, TESTS_INTERVENTION. Investigation confirmed that expression-modulation edges (chemicalIncreasesExpression, chemicalDecreasesExpression from CTD) do NOT qualify drugs for the candidate pool. However, 74 drugs (0.7% of the 10,224-drug pool) qualify only via weaker edge types: 66 via TESTS_INTERVENTION alone (e.g., Coffee, Water, Coconut oil, Contrast Media, BCG vaccine — substances tested as interventions in CVD clinical trials but not therapeutic drugs) and 7 via compoundCausesSideEffect alone (e.g., Lanthanum carbonate, Hydrogen fluoride — compounds whose only CVD-relevant signal is causing side effects). A stricter filter retaining only drugBindsGene, compoundInPharmacologicClass, drugTreatsDisease, and AFFECTS_RESPONSE_TO would reduce the candidate pool by 74 drugs (10,224 → 10,150) with negligible impact on prediction quality. Three flagged drugs (Ifosfamide, Thiotepa, Iopamidol) were examined in detail: Ifosfamide and Thiotepa qualify via drugBindsGene and compoundInPharmacologicClass (alkylating antineoplastics with legitimate pharmacological profiles); Iopamidol (a contrast agent) qualifies via compoundInPharmacologicClass — a harder edge case illustrating that pharmacologic class membership alone can admit non-therapeutic compounds.</w:t>
       </w:r>
     </w:p>
     <w:p>

</xml_diff>